<commit_message>
Extend Rational Inquirer notes and set 1.5 line spacing
Add the rest of page 4 (epistemic norms of inquiry, concerns, football
example) and page 5 (third worry, prescriptive vs evaluative norms).

Co-Authored-By: Claude Opus 5.5 <noreply@anthropic.com>
Claude-Session: https://claude.ai/code/session_01RwaLHrJT94fWDQhNu2whsg
</commit_message>
<xml_diff>
--- a/Rational_Inquirer_5-6_notes.docx
+++ b/Rational_Inquirer_5-6_notes.docx
@@ -685,6 +685,257 @@
       </w:pPr>
       <w:r>
         <w:t xml:space="preserve">3) This means doing things corresponding to competent zetetic dispositions in “science”, like gathering E by experiment</w:t>
+      </w:r>
+    </w:p>
+    <w:p>
+      <w:pPr>
+        <w:pStyle w:val="ListParagraph"/>
+        <w:numPr>
+          <w:ilvl w:val="0"/>
+          <w:numId w:val="2"/>
+        </w:numPr>
+      </w:pPr>
+      <w:r>
+        <w:t xml:space="preserve">Now: epistemic norms of inquiry exist (claim)</w:t>
+      </w:r>
+    </w:p>
+    <w:p>
+      <w:pPr>
+        <w:pStyle w:val="ListParagraph"/>
+        <w:numPr>
+          <w:ilvl w:val="1"/>
+          <w:numId w:val="2"/>
+        </w:numPr>
+      </w:pPr>
+      <w:r>
+        <w:t xml:space="preserve">Duty to double-check is one such norm (p. 69)</w:t>
+      </w:r>
+    </w:p>
+    <w:p>
+      <w:pPr>
+        <w:pStyle w:val="ListParagraph"/>
+        <w:numPr>
+          <w:ilvl w:val="0"/>
+          <w:numId w:val="2"/>
+        </w:numPr>
+      </w:pPr>
+      <w:r>
+        <w:rPr>
+          <w:b/>
+          <w:bCs/>
+        </w:rPr>
+        <w:t xml:space="preserve">Concerns:</w:t>
+      </w:r>
+    </w:p>
+    <w:p>
+      <w:pPr>
+        <w:pStyle w:val="ListParagraph"/>
+        <w:numPr>
+          <w:ilvl w:val="1"/>
+          <w:numId w:val="2"/>
+        </w:numPr>
+      </w:pPr>
+      <w:r>
+        <w:t xml:space="preserve">1) Few-too reasons: HOE encountered, but no duty to DC</w:t>
+      </w:r>
+    </w:p>
+    <w:p>
+      <w:pPr>
+        <w:pStyle w:val="ListParagraph"/>
+        <w:numPr>
+          <w:ilvl w:val="1"/>
+          <w:numId w:val="2"/>
+        </w:numPr>
+      </w:pPr>
+      <w:r>
+        <w:rPr>
+          <w:b/>
+          <w:bCs/>
+        </w:rPr>
+        <w:t xml:space="preserve">Football (p. 70):</w:t>
+      </w:r>
+    </w:p>
+    <w:p>
+      <w:pPr>
+        <w:pStyle w:val="ListParagraph"/>
+        <w:numPr>
+          <w:ilvl w:val="2"/>
+          <w:numId w:val="2"/>
+        </w:numPr>
+      </w:pPr>
+      <w:r>
+        <w:t xml:space="preserve">Sarah doesn’t care about football. She wants to put no effort into football-related INQ. Her friend tells her that Inter beat Real. Then she receives HOE that her testimonial belief-forming is defective.</w:t>
+      </w:r>
+    </w:p>
+    <w:p>
+      <w:pPr>
+        <w:pStyle w:val="ListParagraph"/>
+        <w:numPr>
+          <w:ilvl w:val="0"/>
+          <w:numId w:val="2"/>
+        </w:numPr>
+      </w:pPr>
+      <w:r>
+        <w:rPr>
+          <w:b/>
+          <w:bCs/>
+        </w:rPr>
+        <w:t xml:space="preserve">Third worry (p. 73):</w:t>
+      </w:r>
+    </w:p>
+    <w:p>
+      <w:pPr>
+        <w:pStyle w:val="ListParagraph"/>
+        <w:numPr>
+          <w:ilvl w:val="1"/>
+          <w:numId w:val="2"/>
+        </w:numPr>
+      </w:pPr>
+      <w:r>
+        <w:t xml:space="preserve">P1: Epistemic norms are norms of doxastic states</w:t>
+      </w:r>
+    </w:p>
+    <w:p>
+      <w:pPr>
+        <w:pStyle w:val="ListParagraph"/>
+        <w:numPr>
+          <w:ilvl w:val="1"/>
+          <w:numId w:val="2"/>
+        </w:numPr>
+      </w:pPr>
+      <w:r>
+        <w:t xml:space="preserve">P2: Zetetic activities are not exhausted in the change of doxastic states</w:t>
+      </w:r>
+    </w:p>
+    <w:p>
+      <w:pPr>
+        <w:pStyle w:val="ListParagraph"/>
+        <w:numPr>
+          <w:ilvl w:val="1"/>
+          <w:numId w:val="2"/>
+        </w:numPr>
+      </w:pPr>
+      <w:r>
+        <w:t xml:space="preserve">C: EN cannot govern ZA</w:t>
+      </w:r>
+    </w:p>
+    <w:p>
+      <w:pPr>
+        <w:pStyle w:val="ListParagraph"/>
+        <w:numPr>
+          <w:ilvl w:val="1"/>
+          <w:numId w:val="2"/>
+        </w:numPr>
+      </w:pPr>
+      <w:r>
+        <w:rPr>
+          <w:b/>
+          <w:bCs/>
+        </w:rPr>
+        <w:t xml:space="preserve">Answer:</w:t>
+      </w:r>
+      <w:r>
+        <w:t xml:space="preserve"> P1 is wrong</w:t>
+      </w:r>
+    </w:p>
+    <w:p>
+      <w:pPr>
+        <w:pStyle w:val="ListParagraph"/>
+        <w:numPr>
+          <w:ilvl w:val="2"/>
+          <w:numId w:val="2"/>
+        </w:numPr>
+      </w:pPr>
+      <w:r>
+        <w:t xml:space="preserve">p. 74: synchronicity things</w:t>
+      </w:r>
+    </w:p>
+    <w:p>
+      <w:pPr>
+        <w:pStyle w:val="ListParagraph"/>
+        <w:numPr>
+          <w:ilvl w:val="0"/>
+          <w:numId w:val="2"/>
+        </w:numPr>
+      </w:pPr>
+      <w:r>
+        <w:rPr>
+          <w:b/>
+          <w:bCs/>
+        </w:rPr>
+        <w:t xml:space="preserve">Prescriptive vs evaluative norms</w:t>
+      </w:r>
+    </w:p>
+    <w:p>
+      <w:pPr>
+        <w:pStyle w:val="ListParagraph"/>
+        <w:numPr>
+          <w:ilvl w:val="1"/>
+          <w:numId w:val="2"/>
+        </w:numPr>
+      </w:pPr>
+      <w:r>
+        <w:t xml:space="preserve">Prescriptive: “You ought to do…”</w:t>
+      </w:r>
+    </w:p>
+    <w:p>
+      <w:pPr>
+        <w:pStyle w:val="ListParagraph"/>
+        <w:numPr>
+          <w:ilvl w:val="1"/>
+          <w:numId w:val="2"/>
+        </w:numPr>
+      </w:pPr>
+      <w:r>
+        <w:t xml:space="preserve">Evaluative: “x is good/bad”</w:t>
+      </w:r>
+    </w:p>
+    <w:p>
+      <w:pPr>
+        <w:pStyle w:val="ListParagraph"/>
+        <w:numPr>
+          <w:ilvl w:val="1"/>
+          <w:numId w:val="2"/>
+        </w:numPr>
+      </w:pPr>
+      <w:r>
+        <w:t xml:space="preserve">Problem for prescriptive epistemic norms (ought implies can)</w:t>
+      </w:r>
+    </w:p>
+    <w:p>
+      <w:pPr>
+        <w:pStyle w:val="ListParagraph"/>
+        <w:numPr>
+          <w:ilvl w:val="2"/>
+          <w:numId w:val="2"/>
+        </w:numPr>
+      </w:pPr>
+      <w:r>
+        <w:t xml:space="preserve">Sometimes we can’t double-check when we encounter HOE</w:t>
+      </w:r>
+    </w:p>
+    <w:p>
+      <w:pPr>
+        <w:pStyle w:val="ListParagraph"/>
+        <w:numPr>
+          <w:ilvl w:val="2"/>
+          <w:numId w:val="2"/>
+        </w:numPr>
+      </w:pPr>
+      <w:r>
+        <w:t xml:space="preserve">a) “Anyone in our situation can”</w:t>
+      </w:r>
+    </w:p>
+    <w:p>
+      <w:pPr>
+        <w:pStyle w:val="ListParagraph"/>
+        <w:numPr>
+          <w:ilvl w:val="2"/>
+          <w:numId w:val="2"/>
+        </w:numPr>
+      </w:pPr>
+      <w:r>
+        <w:t xml:space="preserve">b) “In principle can”</w:t>
       </w:r>
     </w:p>
     <w:sectPr>
@@ -915,7 +1166,11 @@
 <w:styles xmlns:mc="http://schemas.openxmlformats.org/markup-compatibility/2006" xmlns:r="http://schemas.openxmlformats.org/officeDocument/2006/relationships" xmlns:w="http://schemas.openxmlformats.org/wordprocessingml/2006/main" xmlns:w14="http://schemas.microsoft.com/office/word/2010/wordml" xmlns:w15="http://schemas.microsoft.com/office/word/2012/wordml" mc:Ignorable="w14 w15">
   <w:docDefaults>
     <w:rPrDefault/>
-    <w:pPrDefault/>
+    <w:pPrDefault>
+      <w:pPr>
+        <w:spacing w:line="360"/>
+      </w:pPr>
+    </w:pPrDefault>
   </w:docDefaults>
   <w:style w:type="paragraph" w:styleId="Normal" w:default="1">
     <w:name w:val="Normal"/>

</xml_diff>